<commit_message>
docs: tagebuch 01.10.26 ergänzt
</commit_message>
<xml_diff>
--- a/Docs/Projekttagebuch_TEAM.docx
+++ b/Docs/Projekttagebuch_TEAM.docx
@@ -1,6 +1,6 @@
 
 <file path=word/document.xml><?xml version="1.0" encoding="utf-8"?>
-<w:document xmlns:wpc="http://schemas.microsoft.com/office/word/2010/wordprocessingCanvas" xmlns:cx="http://schemas.microsoft.com/office/drawing/2014/chartex" xmlns:cx1="http://schemas.microsoft.com/office/drawing/2015/9/8/chartex" xmlns:cx2="http://schemas.microsoft.com/office/drawing/2015/10/21/chartex" xmlns:cx3="http://schemas.microsoft.com/office/drawing/2016/5/9/chartex" xmlns:cx4="http://schemas.microsoft.com/office/drawing/2016/5/10/chartex" xmlns:cx5="http://schemas.microsoft.com/office/drawing/2016/5/11/chartex" xmlns:cx6="http://schemas.microsoft.com/office/drawing/2016/5/12/chartex" xmlns:cx7="http://schemas.microsoft.com/office/drawing/2016/5/13/chartex" xmlns:cx8="http://schemas.microsoft.com/office/drawing/2016/5/14/chartex" xmlns:mc="http://schemas.openxmlformats.org/markup-compatibility/2006" xmlns:m="http://schemas.openxmlformats.org/officeDocument/2006/math" xmlns:aink="http://schemas.microsoft.com/office/drawing/2016/ink" xmlns:am3d="http://schemas.microsoft.com/office/drawing/2017/model3d" xmlns:oel="http://schemas.microsoft.com/office/2019/extlst" xmlns:r="http://schemas.openxmlformats.org/officeDocument/2006/relationships" xmlns:wp14="http://schemas.microsoft.com/office/word/2010/wordprocessingDrawing" xmlns:wp="http://schemas.openxmlformats.org/drawingml/2006/wordprocessingDrawing" xmlns:wpg="http://schemas.microsoft.com/office/word/2010/wordprocessingGroup" xmlns:wpi="http://schemas.microsoft.com/office/word/2010/wordprocessingInk" xmlns:wps="http://schemas.microsoft.com/office/word/2010/wordprocessingShape" xmlns:o="urn:schemas-microsoft-com:office:office" xmlns:v="urn:schemas-microsoft-com:vml" xmlns:w10="urn:schemas-microsoft-com:office:word" xmlns:w="http://schemas.openxmlformats.org/wordprocessingml/2006/main" xmlns:w14="http://schemas.microsoft.com/office/word/2010/wordml" xmlns:w15="http://schemas.microsoft.com/office/word/2012/wordml" xmlns:w16cex="http://schemas.microsoft.com/office/word/2018/wordml/cex" xmlns:w16cid="http://schemas.microsoft.com/office/word/2016/wordml/cid" xmlns:w16="http://schemas.microsoft.com/office/word/2018/wordml" xmlns:w16sdtdh="http://schemas.microsoft.com/office/word/2020/wordml/sdtdatahash" xmlns:w16sdtfl="http://schemas.microsoft.com/office/word/2024/wordml/sdtformatlock" xmlns:w16se="http://schemas.microsoft.com/office/word/2015/wordml/symex" xmlns:w16du="http://schemas.microsoft.com/office/word/2023/wordml/word16du" xmlns:wne="http://schemas.microsoft.com/office/word/2006/wordml" mc:Ignorable="w14 w15 w16se w16cid w16 w16cex w16sdtdh w16sdtfl w16du wp14">
+<w:document xmlns:wpc="http://schemas.microsoft.com/office/word/2010/wordprocessingCanvas" xmlns:cx="http://schemas.microsoft.com/office/drawing/2014/chartex" xmlns:cx1="http://schemas.microsoft.com/office/drawing/2015/9/8/chartex" xmlns:cx2="http://schemas.microsoft.com/office/drawing/2015/10/21/chartex" xmlns:cx3="http://schemas.microsoft.com/office/drawing/2016/5/9/chartex" xmlns:cx4="http://schemas.microsoft.com/office/drawing/2016/5/10/chartex" xmlns:cx5="http://schemas.microsoft.com/office/drawing/2016/5/11/chartex" xmlns:cx6="http://schemas.microsoft.com/office/drawing/2016/5/12/chartex" xmlns:cx7="http://schemas.microsoft.com/office/drawing/2016/5/13/chartex" xmlns:cx8="http://schemas.microsoft.com/office/drawing/2016/5/14/chartex" xmlns:mc="http://schemas.openxmlformats.org/markup-compatibility/2006" xmlns:aink="http://schemas.microsoft.com/office/drawing/2016/ink" xmlns:am3d="http://schemas.microsoft.com/office/drawing/2017/model3d" xmlns:o="urn:schemas-microsoft-com:office:office" xmlns:oel="http://schemas.microsoft.com/office/2019/extlst" xmlns:r="http://schemas.openxmlformats.org/officeDocument/2006/relationships" xmlns:m="http://schemas.openxmlformats.org/officeDocument/2006/math" xmlns:v="urn:schemas-microsoft-com:vml" xmlns:wp14="http://schemas.microsoft.com/office/word/2010/wordprocessingDrawing" xmlns:wp="http://schemas.openxmlformats.org/drawingml/2006/wordprocessingDrawing" xmlns:w10="urn:schemas-microsoft-com:office:word" xmlns:w="http://schemas.openxmlformats.org/wordprocessingml/2006/main" xmlns:w14="http://schemas.microsoft.com/office/word/2010/wordml" xmlns:w15="http://schemas.microsoft.com/office/word/2012/wordml" xmlns:w16cex="http://schemas.microsoft.com/office/word/2018/wordml/cex" xmlns:w16cid="http://schemas.microsoft.com/office/word/2016/wordml/cid" xmlns:w16="http://schemas.microsoft.com/office/word/2018/wordml" xmlns:w16du="http://schemas.microsoft.com/office/word/2023/wordml/word16du" xmlns:w16sdtdh="http://schemas.microsoft.com/office/word/2020/wordml/sdtdatahash" xmlns:w16sdtfl="http://schemas.microsoft.com/office/word/2024/wordml/sdtformatlock" xmlns:w16se="http://schemas.microsoft.com/office/word/2015/wordml/symex" xmlns:wpg="http://schemas.microsoft.com/office/word/2010/wordprocessingGroup" xmlns:wpi="http://schemas.microsoft.com/office/word/2010/wordprocessingInk" xmlns:wne="http://schemas.microsoft.com/office/word/2006/wordml" xmlns:wps="http://schemas.microsoft.com/office/word/2010/wordprocessingShape" mc:Ignorable="w14 w15 w16se w16cid w16 w16cex w16sdtdh w16sdtfl w16du wp14">
   <w:body>
     <w:p>
       <w:pPr>
@@ -323,7 +323,11 @@
           </w:tcPr>
           <w:p>
             <w:r>
-              <w:t>Feedback zum Sequenzdiagramm eingearbeitet. Nick, Felix und Tim erstellten ER-Modell, SQL-Schema und erste Datenbankanbindung. Henry und Alex prüften, welche Daten das Frontend für Tische, Artikel und Bestellungen benötigt. Die Dokumentation wurde gemeinsam aktualisiert.</w:t>
+              <w:t xml:space="preserve">Feedback zum Sequenzdiagramm eingearbeitet. Nick, Felix und Tim erstellten ER-Modell, SQL-Schema und erste Datenbankanbindung. Henry und Alex prüften, welche Daten das Frontend für Tische, Artikel und </w:t>
+            </w:r>
+            <w:r>
+              <w:lastRenderedPageBreak/>
+              <w:t>Bestellungen benötigt. Die Dokumentation wurde gemeinsam aktualisiert.</w:t>
             </w:r>
           </w:p>
         </w:tc>
@@ -333,6 +337,7 @@
           </w:tcPr>
           <w:p>
             <w:r>
+              <w:lastRenderedPageBreak/>
               <w:t>Beziehungen und Fremdschlüssel mussten nachgebessert werden. Lösung: Tabellen und Kardinalitäten abgeglichen und Constraints ergänzt.</w:t>
             </w:r>
           </w:p>
@@ -462,6 +467,39 @@
           <w:p>
             <w:r>
               <w:t>An einigen Stellen gab es doppelte Logik und uneinheitliche Bezeichnungen. Lösung: auffällige Stellen gemeinsam besprochen, verständlicher benannt und vorsichtig refaktoriert. Danach wurden die betroffenen Funktionen erneut getestet.</w:t>
+            </w:r>
+          </w:p>
+        </w:tc>
+      </w:tr>
+      <w:tr>
+        <w:tc>
+          <w:tcPr>
+            <w:tcW w:w="1413" w:type="dxa"/>
+          </w:tcPr>
+          <w:p>
+            <w:r>
+              <w:lastRenderedPageBreak/>
+              <w:t>01.10.2026</w:t>
+            </w:r>
+          </w:p>
+        </w:tc>
+        <w:tc>
+          <w:tcPr>
+            <w:tcW w:w="3969" w:type="dxa"/>
+          </w:tcPr>
+          <w:p>
+            <w:r>
+              <w:t>Gemeinsame Fertigstellung der Projektdokumentation. Nick bearbeitete den Soll-Ausblick, während Felix das Projekttagebuch vervollständigte. Henry schloss die Testdokumentation ab. Tim erstellte passende Backend-Codeausschnitte und erklärte deren Funktionsweise für die Dokumentation. Alex übernahm die gleiche Aufgabe für das Frontend.</w:t>
+            </w:r>
+          </w:p>
+        </w:tc>
+        <w:tc>
+          <w:tcPr>
+            <w:tcW w:w="3685" w:type="dxa"/>
+          </w:tcPr>
+          <w:p>
+            <w:r>
+              <w:t>Bei der Zusammenstellung der Dokumentation mussten teilweise noch fehlende Inhalte ergänzt und an den aktuellen Projektstand angepasst werden. Lösung: Die Aufgaben wurden untereinander aufgeteilt und die einzelnen Dokumentationsteile anschließend auf Vollständigkeit überprüft.</w:t>
             </w:r>
           </w:p>
         </w:tc>
@@ -469,6 +507,9 @@
     </w:tbl>
     <w:p/>
     <w:sectPr>
+      <w:headerReference w:type="even" r:id="rId6"/>
+      <w:headerReference w:type="default" r:id="rId7"/>
+      <w:headerReference w:type="first" r:id="rId8"/>
       <w:pgSz w:w="11900" w:h="16840"/>
       <w:pgMar w:top="1417" w:right="1417" w:bottom="1134" w:left="1417" w:header="708" w:footer="708" w:gutter="0"/>
       <w:cols w:space="708"/>
@@ -478,8 +519,433 @@
 </w:document>
 </file>
 
+<file path=word/endnotes.xml><?xml version="1.0" encoding="utf-8"?>
+<w:endnotes xmlns:wpc="http://schemas.microsoft.com/office/word/2010/wordprocessingCanvas" xmlns:cx="http://schemas.microsoft.com/office/drawing/2014/chartex" xmlns:cx1="http://schemas.microsoft.com/office/drawing/2015/9/8/chartex" xmlns:cx2="http://schemas.microsoft.com/office/drawing/2015/10/21/chartex" xmlns:cx3="http://schemas.microsoft.com/office/drawing/2016/5/9/chartex" xmlns:cx4="http://schemas.microsoft.com/office/drawing/2016/5/10/chartex" xmlns:cx5="http://schemas.microsoft.com/office/drawing/2016/5/11/chartex" xmlns:cx6="http://schemas.microsoft.com/office/drawing/2016/5/12/chartex" xmlns:cx7="http://schemas.microsoft.com/office/drawing/2016/5/13/chartex" xmlns:cx8="http://schemas.microsoft.com/office/drawing/2016/5/14/chartex" xmlns:mc="http://schemas.openxmlformats.org/markup-compatibility/2006" xmlns:aink="http://schemas.microsoft.com/office/drawing/2016/ink" xmlns:am3d="http://schemas.microsoft.com/office/drawing/2017/model3d" xmlns:o="urn:schemas-microsoft-com:office:office" xmlns:oel="http://schemas.microsoft.com/office/2019/extlst" xmlns:r="http://schemas.openxmlformats.org/officeDocument/2006/relationships" xmlns:m="http://schemas.openxmlformats.org/officeDocument/2006/math" xmlns:v="urn:schemas-microsoft-com:vml" xmlns:wp14="http://schemas.microsoft.com/office/word/2010/wordprocessingDrawing" xmlns:wp="http://schemas.openxmlformats.org/drawingml/2006/wordprocessingDrawing" xmlns:w10="urn:schemas-microsoft-com:office:word" xmlns:w="http://schemas.openxmlformats.org/wordprocessingml/2006/main" xmlns:w14="http://schemas.microsoft.com/office/word/2010/wordml" xmlns:w15="http://schemas.microsoft.com/office/word/2012/wordml" xmlns:w16cex="http://schemas.microsoft.com/office/word/2018/wordml/cex" xmlns:w16cid="http://schemas.microsoft.com/office/word/2016/wordml/cid" xmlns:w16="http://schemas.microsoft.com/office/word/2018/wordml" xmlns:w16du="http://schemas.microsoft.com/office/word/2023/wordml/word16du" xmlns:w16sdtdh="http://schemas.microsoft.com/office/word/2020/wordml/sdtdatahash" xmlns:w16sdtfl="http://schemas.microsoft.com/office/word/2024/wordml/sdtformatlock" xmlns:w16se="http://schemas.microsoft.com/office/word/2015/wordml/symex" xmlns:wpg="http://schemas.microsoft.com/office/word/2010/wordprocessingGroup" xmlns:wpi="http://schemas.microsoft.com/office/word/2010/wordprocessingInk" xmlns:wne="http://schemas.microsoft.com/office/word/2006/wordml" xmlns:wps="http://schemas.microsoft.com/office/word/2010/wordprocessingShape" mc:Ignorable="w14 w15 w16se w16cid w16 w16cex w16sdtdh w16sdtfl w16du wp14">
+  <w:endnote w:type="separator" w:id="-1">
+    <w:p>
+      <w:r>
+        <w:separator/>
+      </w:r>
+    </w:p>
+  </w:endnote>
+  <w:endnote w:type="continuationSeparator" w:id="0">
+    <w:p>
+      <w:r>
+        <w:continuationSeparator/>
+      </w:r>
+    </w:p>
+  </w:endnote>
+</w:endnotes>
+</file>
+
+<file path=word/footnotes.xml><?xml version="1.0" encoding="utf-8"?>
+<w:footnotes xmlns:wpc="http://schemas.microsoft.com/office/word/2010/wordprocessingCanvas" xmlns:cx="http://schemas.microsoft.com/office/drawing/2014/chartex" xmlns:cx1="http://schemas.microsoft.com/office/drawing/2015/9/8/chartex" xmlns:cx2="http://schemas.microsoft.com/office/drawing/2015/10/21/chartex" xmlns:cx3="http://schemas.microsoft.com/office/drawing/2016/5/9/chartex" xmlns:cx4="http://schemas.microsoft.com/office/drawing/2016/5/10/chartex" xmlns:cx5="http://schemas.microsoft.com/office/drawing/2016/5/11/chartex" xmlns:cx6="http://schemas.microsoft.com/office/drawing/2016/5/12/chartex" xmlns:cx7="http://schemas.microsoft.com/office/drawing/2016/5/13/chartex" xmlns:cx8="http://schemas.microsoft.com/office/drawing/2016/5/14/chartex" xmlns:mc="http://schemas.openxmlformats.org/markup-compatibility/2006" xmlns:aink="http://schemas.microsoft.com/office/drawing/2016/ink" xmlns:am3d="http://schemas.microsoft.com/office/drawing/2017/model3d" xmlns:o="urn:schemas-microsoft-com:office:office" xmlns:oel="http://schemas.microsoft.com/office/2019/extlst" xmlns:r="http://schemas.openxmlformats.org/officeDocument/2006/relationships" xmlns:m="http://schemas.openxmlformats.org/officeDocument/2006/math" xmlns:v="urn:schemas-microsoft-com:vml" xmlns:wp14="http://schemas.microsoft.com/office/word/2010/wordprocessingDrawing" xmlns:wp="http://schemas.openxmlformats.org/drawingml/2006/wordprocessingDrawing" xmlns:w10="urn:schemas-microsoft-com:office:word" xmlns:w="http://schemas.openxmlformats.org/wordprocessingml/2006/main" xmlns:w14="http://schemas.microsoft.com/office/word/2010/wordml" xmlns:w15="http://schemas.microsoft.com/office/word/2012/wordml" xmlns:w16cex="http://schemas.microsoft.com/office/word/2018/wordml/cex" xmlns:w16cid="http://schemas.microsoft.com/office/word/2016/wordml/cid" xmlns:w16="http://schemas.microsoft.com/office/word/2018/wordml" xmlns:w16du="http://schemas.microsoft.com/office/word/2023/wordml/word16du" xmlns:w16sdtdh="http://schemas.microsoft.com/office/word/2020/wordml/sdtdatahash" xmlns:w16sdtfl="http://schemas.microsoft.com/office/word/2024/wordml/sdtformatlock" xmlns:w16se="http://schemas.microsoft.com/office/word/2015/wordml/symex" xmlns:wpg="http://schemas.microsoft.com/office/word/2010/wordprocessingGroup" xmlns:wpi="http://schemas.microsoft.com/office/word/2010/wordprocessingInk" xmlns:wne="http://schemas.microsoft.com/office/word/2006/wordml" xmlns:wps="http://schemas.microsoft.com/office/word/2010/wordprocessingShape" mc:Ignorable="w14 w15 w16se w16cid w16 w16cex w16sdtdh w16sdtfl w16du wp14">
+  <w:footnote w:type="separator" w:id="-1">
+    <w:p>
+      <w:r>
+        <w:separator/>
+      </w:r>
+    </w:p>
+  </w:footnote>
+  <w:footnote w:type="continuationSeparator" w:id="0">
+    <w:p>
+      <w:r>
+        <w:continuationSeparator/>
+      </w:r>
+    </w:p>
+  </w:footnote>
+</w:footnotes>
+</file>
+
+<file path=word/header1.xml><?xml version="1.0" encoding="utf-8"?>
+<w:hdr xmlns:wpc="http://schemas.microsoft.com/office/word/2010/wordprocessingCanvas" xmlns:cx="http://schemas.microsoft.com/office/drawing/2014/chartex" xmlns:cx1="http://schemas.microsoft.com/office/drawing/2015/9/8/chartex" xmlns:cx2="http://schemas.microsoft.com/office/drawing/2015/10/21/chartex" xmlns:cx3="http://schemas.microsoft.com/office/drawing/2016/5/9/chartex" xmlns:cx4="http://schemas.microsoft.com/office/drawing/2016/5/10/chartex" xmlns:cx5="http://schemas.microsoft.com/office/drawing/2016/5/11/chartex" xmlns:cx6="http://schemas.microsoft.com/office/drawing/2016/5/12/chartex" xmlns:cx7="http://schemas.microsoft.com/office/drawing/2016/5/13/chartex" xmlns:cx8="http://schemas.microsoft.com/office/drawing/2016/5/14/chartex" xmlns:mc="http://schemas.openxmlformats.org/markup-compatibility/2006" xmlns:aink="http://schemas.microsoft.com/office/drawing/2016/ink" xmlns:am3d="http://schemas.microsoft.com/office/drawing/2017/model3d" xmlns:o="urn:schemas-microsoft-com:office:office" xmlns:oel="http://schemas.microsoft.com/office/2019/extlst" xmlns:r="http://schemas.openxmlformats.org/officeDocument/2006/relationships" xmlns:m="http://schemas.openxmlformats.org/officeDocument/2006/math" xmlns:v="urn:schemas-microsoft-com:vml" xmlns:wp14="http://schemas.microsoft.com/office/word/2010/wordprocessingDrawing" xmlns:wp="http://schemas.openxmlformats.org/drawingml/2006/wordprocessingDrawing" xmlns:w10="urn:schemas-microsoft-com:office:word" xmlns:w="http://schemas.openxmlformats.org/wordprocessingml/2006/main" xmlns:w14="http://schemas.microsoft.com/office/word/2010/wordml" xmlns:w15="http://schemas.microsoft.com/office/word/2012/wordml" xmlns:w16cex="http://schemas.microsoft.com/office/word/2018/wordml/cex" xmlns:w16cid="http://schemas.microsoft.com/office/word/2016/wordml/cid" xmlns:w16="http://schemas.microsoft.com/office/word/2018/wordml" xmlns:w16du="http://schemas.microsoft.com/office/word/2023/wordml/word16du" xmlns:w16sdtdh="http://schemas.microsoft.com/office/word/2020/wordml/sdtdatahash" xmlns:w16sdtfl="http://schemas.microsoft.com/office/word/2024/wordml/sdtformatlock" xmlns:w16se="http://schemas.microsoft.com/office/word/2015/wordml/symex" xmlns:wpg="http://schemas.microsoft.com/office/word/2010/wordprocessingGroup" xmlns:wpi="http://schemas.microsoft.com/office/word/2010/wordprocessingInk" xmlns:wne="http://schemas.microsoft.com/office/word/2006/wordml" xmlns:wps="http://schemas.microsoft.com/office/word/2010/wordprocessingShape" mc:Ignorable="w14 w15 w16se w16cid w16 w16cex w16sdtdh w16sdtfl w16du wp14">
+  <w:p>
+    <w:pPr>
+      <w:pStyle w:val="Kopfzeile"/>
+    </w:pPr>
+    <w:r>
+      <w:rPr>
+        <w:noProof/>
+      </w:rPr>
+      <mc:AlternateContent>
+        <mc:Choice Requires="wps">
+          <w:drawing>
+            <wp:anchor distT="0" distB="0" distL="0" distR="0" simplePos="0" relativeHeight="251659264" behindDoc="0" locked="0" layoutInCell="1" allowOverlap="1" wp14:anchorId="15F5B55B" wp14:editId="34BD62F6">
+              <wp:simplePos x="635" y="635"/>
+              <wp:positionH relativeFrom="page">
+                <wp:align>left</wp:align>
+              </wp:positionH>
+              <wp:positionV relativeFrom="page">
+                <wp:align>top</wp:align>
+              </wp:positionV>
+              <wp:extent cx="282575" cy="307340"/>
+              <wp:effectExtent l="0" t="0" r="3175" b="16510"/>
+              <wp:wrapNone/>
+              <wp:docPr id="286152503" name="Textfeld 2" descr=" ">
+                <a:extLst xmlns:a="http://schemas.openxmlformats.org/drawingml/2006/main">
+                  <a:ext uri="{5AE41FA2-C0FF-4470-9BD4-5FADCA87CBE2}">
+                    <aclsh:classification xmlns:aclsh="http://schemas.microsoft.com/office/drawing/2020/classificationShape" classificationOutcomeType="hdr"/>
+                  </a:ext>
+                </a:extLst>
+              </wp:docPr>
+              <wp:cNvGraphicFramePr/>
+              <a:graphic xmlns:a="http://schemas.openxmlformats.org/drawingml/2006/main">
+                <a:graphicData uri="http://schemas.microsoft.com/office/word/2010/wordprocessingShape">
+                  <wps:wsp>
+                    <wps:cNvSpPr txBox="1"/>
+                    <wps:spPr>
+                      <a:xfrm>
+                        <a:off x="0" y="0"/>
+                        <a:ext cx="282575" cy="307340"/>
+                      </a:xfrm>
+                      <a:prstGeom prst="rect">
+                        <a:avLst/>
+                      </a:prstGeom>
+                      <a:noFill/>
+                      <a:ln>
+                        <a:noFill/>
+                      </a:ln>
+                    </wps:spPr>
+                    <wps:txbx>
+                      <w:txbxContent>
+                        <w:p>
+                          <w:pPr>
+                            <w:rPr>
+                              <w:rFonts w:ascii="Arial" w:eastAsia="Arial" w:hAnsi="Arial" w:cs="Arial"/>
+                              <w:noProof/>
+                              <w:color w:val="000000"/>
+                              <w:sz w:val="16"/>
+                              <w:szCs w:val="16"/>
+                            </w:rPr>
+                          </w:pPr>
+                          <w:r>
+                            <w:rPr>
+                              <w:rFonts w:ascii="Arial" w:eastAsia="Arial" w:hAnsi="Arial" w:cs="Arial"/>
+                              <w:noProof/>
+                              <w:color w:val="000000"/>
+                              <w:sz w:val="16"/>
+                              <w:szCs w:val="16"/>
+                            </w:rPr>
+                            <w:t xml:space="preserve"> </w:t>
+                          </w:r>
+                        </w:p>
+                      </w:txbxContent>
+                    </wps:txbx>
+                    <wps:bodyPr rot="0" spcFirstLastPara="0" vertOverflow="overflow" horzOverflow="overflow" vert="horz" wrap="none" lIns="254000" tIns="190500" rIns="0" bIns="0" numCol="1" spcCol="0" rtlCol="0" fromWordArt="0" anchor="t" anchorCtr="0" forceAA="0" compatLnSpc="1">
+                      <a:prstTxWarp prst="textNoShape">
+                        <a:avLst/>
+                      </a:prstTxWarp>
+                      <a:spAutoFit/>
+                    </wps:bodyPr>
+                  </wps:wsp>
+                </a:graphicData>
+              </a:graphic>
+            </wp:anchor>
+          </w:drawing>
+        </mc:Choice>
+        <mc:Fallback>
+          <w:pict>
+            <v:shapetype w14:anchorId="15F5B55B" id="_x0000_t202" coordsize="21600,21600" o:spt="202" path="m,l,21600r21600,l21600,xe">
+              <v:stroke joinstyle="miter"/>
+              <v:path gradientshapeok="t" o:connecttype="rect"/>
+            </v:shapetype>
+            <v:shape id="Textfeld 2" o:spid="_x0000_s1026" type="#_x0000_t202" alt=" " style="position:absolute;margin-left:0;margin-top:0;width:22.25pt;height:24.2pt;z-index:251659264;visibility:visible;mso-wrap-style:none;mso-wrap-distance-left:0;mso-wrap-distance-top:0;mso-wrap-distance-right:0;mso-wrap-distance-bottom:0;mso-position-horizontal:left;mso-position-horizontal-relative:page;mso-position-vertical:top;mso-position-vertical-relative:page;v-text-anchor:top" o:gfxdata="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" filled="f" stroked="f">
+              <v:fill o:detectmouseclick="t"/>
+              <v:textbox style="mso-fit-shape-to-text:t" inset="20pt,15pt,0,0">
+                <w:txbxContent>
+                  <w:p>
+                    <w:pPr>
+                      <w:rPr>
+                        <w:rFonts w:ascii="Arial" w:eastAsia="Arial" w:hAnsi="Arial" w:cs="Arial"/>
+                        <w:noProof/>
+                        <w:color w:val="000000"/>
+                        <w:sz w:val="16"/>
+                        <w:szCs w:val="16"/>
+                      </w:rPr>
+                    </w:pPr>
+                    <w:r>
+                      <w:rPr>
+                        <w:rFonts w:ascii="Arial" w:eastAsia="Arial" w:hAnsi="Arial" w:cs="Arial"/>
+                        <w:noProof/>
+                        <w:color w:val="000000"/>
+                        <w:sz w:val="16"/>
+                        <w:szCs w:val="16"/>
+                      </w:rPr>
+                      <w:t xml:space="preserve"> </w:t>
+                    </w:r>
+                  </w:p>
+                </w:txbxContent>
+              </v:textbox>
+              <w10:wrap anchorx="page" anchory="page"/>
+            </v:shape>
+          </w:pict>
+        </mc:Fallback>
+      </mc:AlternateContent>
+    </w:r>
+  </w:p>
+</w:hdr>
+</file>
+
+<file path=word/header2.xml><?xml version="1.0" encoding="utf-8"?>
+<w:hdr xmlns:wpc="http://schemas.microsoft.com/office/word/2010/wordprocessingCanvas" xmlns:cx="http://schemas.microsoft.com/office/drawing/2014/chartex" xmlns:cx1="http://schemas.microsoft.com/office/drawing/2015/9/8/chartex" xmlns:cx2="http://schemas.microsoft.com/office/drawing/2015/10/21/chartex" xmlns:cx3="http://schemas.microsoft.com/office/drawing/2016/5/9/chartex" xmlns:cx4="http://schemas.microsoft.com/office/drawing/2016/5/10/chartex" xmlns:cx5="http://schemas.microsoft.com/office/drawing/2016/5/11/chartex" xmlns:cx6="http://schemas.microsoft.com/office/drawing/2016/5/12/chartex" xmlns:cx7="http://schemas.microsoft.com/office/drawing/2016/5/13/chartex" xmlns:cx8="http://schemas.microsoft.com/office/drawing/2016/5/14/chartex" xmlns:mc="http://schemas.openxmlformats.org/markup-compatibility/2006" xmlns:aink="http://schemas.microsoft.com/office/drawing/2016/ink" xmlns:am3d="http://schemas.microsoft.com/office/drawing/2017/model3d" xmlns:o="urn:schemas-microsoft-com:office:office" xmlns:oel="http://schemas.microsoft.com/office/2019/extlst" xmlns:r="http://schemas.openxmlformats.org/officeDocument/2006/relationships" xmlns:m="http://schemas.openxmlformats.org/officeDocument/2006/math" xmlns:v="urn:schemas-microsoft-com:vml" xmlns:wp14="http://schemas.microsoft.com/office/word/2010/wordprocessingDrawing" xmlns:wp="http://schemas.openxmlformats.org/drawingml/2006/wordprocessingDrawing" xmlns:w10="urn:schemas-microsoft-com:office:word" xmlns:w="http://schemas.openxmlformats.org/wordprocessingml/2006/main" xmlns:w14="http://schemas.microsoft.com/office/word/2010/wordml" xmlns:w15="http://schemas.microsoft.com/office/word/2012/wordml" xmlns:w16cex="http://schemas.microsoft.com/office/word/2018/wordml/cex" xmlns:w16cid="http://schemas.microsoft.com/office/word/2016/wordml/cid" xmlns:w16="http://schemas.microsoft.com/office/word/2018/wordml" xmlns:w16du="http://schemas.microsoft.com/office/word/2023/wordml/word16du" xmlns:w16sdtdh="http://schemas.microsoft.com/office/word/2020/wordml/sdtdatahash" xmlns:w16sdtfl="http://schemas.microsoft.com/office/word/2024/wordml/sdtformatlock" xmlns:w16se="http://schemas.microsoft.com/office/word/2015/wordml/symex" xmlns:wpg="http://schemas.microsoft.com/office/word/2010/wordprocessingGroup" xmlns:wpi="http://schemas.microsoft.com/office/word/2010/wordprocessingInk" xmlns:wne="http://schemas.microsoft.com/office/word/2006/wordml" xmlns:wps="http://schemas.microsoft.com/office/word/2010/wordprocessingShape" mc:Ignorable="w14 w15 w16se w16cid w16 w16cex w16sdtdh w16sdtfl w16du wp14">
+  <w:p>
+    <w:pPr>
+      <w:pStyle w:val="Kopfzeile"/>
+    </w:pPr>
+    <w:r>
+      <w:rPr>
+        <w:noProof/>
+      </w:rPr>
+      <mc:AlternateContent>
+        <mc:Choice Requires="wps">
+          <w:drawing>
+            <wp:anchor distT="0" distB="0" distL="0" distR="0" simplePos="0" relativeHeight="251660288" behindDoc="0" locked="0" layoutInCell="1" allowOverlap="1" wp14:anchorId="4AE286AD" wp14:editId="444F51A7">
+              <wp:simplePos x="899160" y="449580"/>
+              <wp:positionH relativeFrom="page">
+                <wp:align>left</wp:align>
+              </wp:positionH>
+              <wp:positionV relativeFrom="page">
+                <wp:align>top</wp:align>
+              </wp:positionV>
+              <wp:extent cx="282575" cy="307340"/>
+              <wp:effectExtent l="0" t="0" r="3175" b="16510"/>
+              <wp:wrapNone/>
+              <wp:docPr id="1951514737" name="Textfeld 3" descr=" ">
+                <a:extLst xmlns:a="http://schemas.openxmlformats.org/drawingml/2006/main">
+                  <a:ext uri="{5AE41FA2-C0FF-4470-9BD4-5FADCA87CBE2}">
+                    <aclsh:classification xmlns:aclsh="http://schemas.microsoft.com/office/drawing/2020/classificationShape" classificationOutcomeType="hdr"/>
+                  </a:ext>
+                </a:extLst>
+              </wp:docPr>
+              <wp:cNvGraphicFramePr/>
+              <a:graphic xmlns:a="http://schemas.openxmlformats.org/drawingml/2006/main">
+                <a:graphicData uri="http://schemas.microsoft.com/office/word/2010/wordprocessingShape">
+                  <wps:wsp>
+                    <wps:cNvSpPr txBox="1"/>
+                    <wps:spPr>
+                      <a:xfrm>
+                        <a:off x="0" y="0"/>
+                        <a:ext cx="282575" cy="307340"/>
+                      </a:xfrm>
+                      <a:prstGeom prst="rect">
+                        <a:avLst/>
+                      </a:prstGeom>
+                      <a:noFill/>
+                      <a:ln>
+                        <a:noFill/>
+                      </a:ln>
+                    </wps:spPr>
+                    <wps:txbx>
+                      <w:txbxContent>
+                        <w:p>
+                          <w:pPr>
+                            <w:rPr>
+                              <w:rFonts w:ascii="Arial" w:eastAsia="Arial" w:hAnsi="Arial" w:cs="Arial"/>
+                              <w:noProof/>
+                              <w:color w:val="000000"/>
+                              <w:sz w:val="16"/>
+                              <w:szCs w:val="16"/>
+                            </w:rPr>
+                          </w:pPr>
+                          <w:r>
+                            <w:rPr>
+                              <w:rFonts w:ascii="Arial" w:eastAsia="Arial" w:hAnsi="Arial" w:cs="Arial"/>
+                              <w:noProof/>
+                              <w:color w:val="000000"/>
+                              <w:sz w:val="16"/>
+                              <w:szCs w:val="16"/>
+                            </w:rPr>
+                            <w:t xml:space="preserve"> </w:t>
+                          </w:r>
+                        </w:p>
+                      </w:txbxContent>
+                    </wps:txbx>
+                    <wps:bodyPr rot="0" spcFirstLastPara="0" vertOverflow="overflow" horzOverflow="overflow" vert="horz" wrap="none" lIns="254000" tIns="190500" rIns="0" bIns="0" numCol="1" spcCol="0" rtlCol="0" fromWordArt="0" anchor="t" anchorCtr="0" forceAA="0" compatLnSpc="1">
+                      <a:prstTxWarp prst="textNoShape">
+                        <a:avLst/>
+                      </a:prstTxWarp>
+                      <a:spAutoFit/>
+                    </wps:bodyPr>
+                  </wps:wsp>
+                </a:graphicData>
+              </a:graphic>
+            </wp:anchor>
+          </w:drawing>
+        </mc:Choice>
+        <mc:Fallback>
+          <w:pict>
+            <v:shapetype w14:anchorId="4AE286AD" id="_x0000_t202" coordsize="21600,21600" o:spt="202" path="m,l,21600r21600,l21600,xe">
+              <v:stroke joinstyle="miter"/>
+              <v:path gradientshapeok="t" o:connecttype="rect"/>
+            </v:shapetype>
+            <v:shape id="Textfeld 3" o:spid="_x0000_s1027" type="#_x0000_t202" alt=" " style="position:absolute;margin-left:0;margin-top:0;width:22.25pt;height:24.2pt;z-index:251660288;visibility:visible;mso-wrap-style:none;mso-wrap-distance-left:0;mso-wrap-distance-top:0;mso-wrap-distance-right:0;mso-wrap-distance-bottom:0;mso-position-horizontal:left;mso-position-horizontal-relative:page;mso-position-vertical:top;mso-position-vertical-relative:page;v-text-anchor:top" o:gfxdata="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" filled="f" stroked="f">
+              <v:fill o:detectmouseclick="t"/>
+              <v:textbox style="mso-fit-shape-to-text:t" inset="20pt,15pt,0,0">
+                <w:txbxContent>
+                  <w:p>
+                    <w:pPr>
+                      <w:rPr>
+                        <w:rFonts w:ascii="Arial" w:eastAsia="Arial" w:hAnsi="Arial" w:cs="Arial"/>
+                        <w:noProof/>
+                        <w:color w:val="000000"/>
+                        <w:sz w:val="16"/>
+                        <w:szCs w:val="16"/>
+                      </w:rPr>
+                    </w:pPr>
+                    <w:r>
+                      <w:rPr>
+                        <w:rFonts w:ascii="Arial" w:eastAsia="Arial" w:hAnsi="Arial" w:cs="Arial"/>
+                        <w:noProof/>
+                        <w:color w:val="000000"/>
+                        <w:sz w:val="16"/>
+                        <w:szCs w:val="16"/>
+                      </w:rPr>
+                      <w:t xml:space="preserve"> </w:t>
+                    </w:r>
+                  </w:p>
+                </w:txbxContent>
+              </v:textbox>
+              <w10:wrap anchorx="page" anchory="page"/>
+            </v:shape>
+          </w:pict>
+        </mc:Fallback>
+      </mc:AlternateContent>
+    </w:r>
+  </w:p>
+</w:hdr>
+</file>
+
+<file path=word/header3.xml><?xml version="1.0" encoding="utf-8"?>
+<w:hdr xmlns:wpc="http://schemas.microsoft.com/office/word/2010/wordprocessingCanvas" xmlns:cx="http://schemas.microsoft.com/office/drawing/2014/chartex" xmlns:cx1="http://schemas.microsoft.com/office/drawing/2015/9/8/chartex" xmlns:cx2="http://schemas.microsoft.com/office/drawing/2015/10/21/chartex" xmlns:cx3="http://schemas.microsoft.com/office/drawing/2016/5/9/chartex" xmlns:cx4="http://schemas.microsoft.com/office/drawing/2016/5/10/chartex" xmlns:cx5="http://schemas.microsoft.com/office/drawing/2016/5/11/chartex" xmlns:cx6="http://schemas.microsoft.com/office/drawing/2016/5/12/chartex" xmlns:cx7="http://schemas.microsoft.com/office/drawing/2016/5/13/chartex" xmlns:cx8="http://schemas.microsoft.com/office/drawing/2016/5/14/chartex" xmlns:mc="http://schemas.openxmlformats.org/markup-compatibility/2006" xmlns:aink="http://schemas.microsoft.com/office/drawing/2016/ink" xmlns:am3d="http://schemas.microsoft.com/office/drawing/2017/model3d" xmlns:o="urn:schemas-microsoft-com:office:office" xmlns:oel="http://schemas.microsoft.com/office/2019/extlst" xmlns:r="http://schemas.openxmlformats.org/officeDocument/2006/relationships" xmlns:m="http://schemas.openxmlformats.org/officeDocument/2006/math" xmlns:v="urn:schemas-microsoft-com:vml" xmlns:wp14="http://schemas.microsoft.com/office/word/2010/wordprocessingDrawing" xmlns:wp="http://schemas.openxmlformats.org/drawingml/2006/wordprocessingDrawing" xmlns:w10="urn:schemas-microsoft-com:office:word" xmlns:w="http://schemas.openxmlformats.org/wordprocessingml/2006/main" xmlns:w14="http://schemas.microsoft.com/office/word/2010/wordml" xmlns:w15="http://schemas.microsoft.com/office/word/2012/wordml" xmlns:w16cex="http://schemas.microsoft.com/office/word/2018/wordml/cex" xmlns:w16cid="http://schemas.microsoft.com/office/word/2016/wordml/cid" xmlns:w16="http://schemas.microsoft.com/office/word/2018/wordml" xmlns:w16du="http://schemas.microsoft.com/office/word/2023/wordml/word16du" xmlns:w16sdtdh="http://schemas.microsoft.com/office/word/2020/wordml/sdtdatahash" xmlns:w16sdtfl="http://schemas.microsoft.com/office/word/2024/wordml/sdtformatlock" xmlns:w16se="http://schemas.microsoft.com/office/word/2015/wordml/symex" xmlns:wpg="http://schemas.microsoft.com/office/word/2010/wordprocessingGroup" xmlns:wpi="http://schemas.microsoft.com/office/word/2010/wordprocessingInk" xmlns:wne="http://schemas.microsoft.com/office/word/2006/wordml" xmlns:wps="http://schemas.microsoft.com/office/word/2010/wordprocessingShape" mc:Ignorable="w14 w15 w16se w16cid w16 w16cex w16sdtdh w16sdtfl w16du wp14">
+  <w:p>
+    <w:pPr>
+      <w:pStyle w:val="Kopfzeile"/>
+    </w:pPr>
+    <w:r>
+      <w:rPr>
+        <w:noProof/>
+      </w:rPr>
+      <mc:AlternateContent>
+        <mc:Choice Requires="wps">
+          <w:drawing>
+            <wp:anchor distT="0" distB="0" distL="0" distR="0" simplePos="0" relativeHeight="251658240" behindDoc="0" locked="0" layoutInCell="1" allowOverlap="1" wp14:anchorId="12AD56F0" wp14:editId="5CF7E0E5">
+              <wp:simplePos x="635" y="635"/>
+              <wp:positionH relativeFrom="page">
+                <wp:align>left</wp:align>
+              </wp:positionH>
+              <wp:positionV relativeFrom="page">
+                <wp:align>top</wp:align>
+              </wp:positionV>
+              <wp:extent cx="282575" cy="307340"/>
+              <wp:effectExtent l="0" t="0" r="3175" b="16510"/>
+              <wp:wrapNone/>
+              <wp:docPr id="443990299" name="Textfeld 1" descr=" ">
+                <a:extLst xmlns:a="http://schemas.openxmlformats.org/drawingml/2006/main">
+                  <a:ext uri="{5AE41FA2-C0FF-4470-9BD4-5FADCA87CBE2}">
+                    <aclsh:classification xmlns:aclsh="http://schemas.microsoft.com/office/drawing/2020/classificationShape" classificationOutcomeType="hdr"/>
+                  </a:ext>
+                </a:extLst>
+              </wp:docPr>
+              <wp:cNvGraphicFramePr/>
+              <a:graphic xmlns:a="http://schemas.openxmlformats.org/drawingml/2006/main">
+                <a:graphicData uri="http://schemas.microsoft.com/office/word/2010/wordprocessingShape">
+                  <wps:wsp>
+                    <wps:cNvSpPr txBox="1"/>
+                    <wps:spPr>
+                      <a:xfrm>
+                        <a:off x="0" y="0"/>
+                        <a:ext cx="282575" cy="307340"/>
+                      </a:xfrm>
+                      <a:prstGeom prst="rect">
+                        <a:avLst/>
+                      </a:prstGeom>
+                      <a:noFill/>
+                      <a:ln>
+                        <a:noFill/>
+                      </a:ln>
+                    </wps:spPr>
+                    <wps:txbx>
+                      <w:txbxContent>
+                        <w:p>
+                          <w:pPr>
+                            <w:rPr>
+                              <w:rFonts w:ascii="Arial" w:eastAsia="Arial" w:hAnsi="Arial" w:cs="Arial"/>
+                              <w:noProof/>
+                              <w:color w:val="000000"/>
+                              <w:sz w:val="16"/>
+                              <w:szCs w:val="16"/>
+                            </w:rPr>
+                          </w:pPr>
+                          <w:r>
+                            <w:rPr>
+                              <w:rFonts w:ascii="Arial" w:eastAsia="Arial" w:hAnsi="Arial" w:cs="Arial"/>
+                              <w:noProof/>
+                              <w:color w:val="000000"/>
+                              <w:sz w:val="16"/>
+                              <w:szCs w:val="16"/>
+                            </w:rPr>
+                            <w:t xml:space="preserve"> </w:t>
+                          </w:r>
+                        </w:p>
+                      </w:txbxContent>
+                    </wps:txbx>
+                    <wps:bodyPr rot="0" spcFirstLastPara="0" vertOverflow="overflow" horzOverflow="overflow" vert="horz" wrap="none" lIns="254000" tIns="190500" rIns="0" bIns="0" numCol="1" spcCol="0" rtlCol="0" fromWordArt="0" anchor="t" anchorCtr="0" forceAA="0" compatLnSpc="1">
+                      <a:prstTxWarp prst="textNoShape">
+                        <a:avLst/>
+                      </a:prstTxWarp>
+                      <a:spAutoFit/>
+                    </wps:bodyPr>
+                  </wps:wsp>
+                </a:graphicData>
+              </a:graphic>
+            </wp:anchor>
+          </w:drawing>
+        </mc:Choice>
+        <mc:Fallback>
+          <w:pict>
+            <v:shapetype w14:anchorId="12AD56F0" id="_x0000_t202" coordsize="21600,21600" o:spt="202" path="m,l,21600r21600,l21600,xe">
+              <v:stroke joinstyle="miter"/>
+              <v:path gradientshapeok="t" o:connecttype="rect"/>
+            </v:shapetype>
+            <v:shape id="Textfeld 1" o:spid="_x0000_s1028" type="#_x0000_t202" alt=" " style="position:absolute;margin-left:0;margin-top:0;width:22.25pt;height:24.2pt;z-index:251658240;visibility:visible;mso-wrap-style:none;mso-wrap-distance-left:0;mso-wrap-distance-top:0;mso-wrap-distance-right:0;mso-wrap-distance-bottom:0;mso-position-horizontal:left;mso-position-horizontal-relative:page;mso-position-vertical:top;mso-position-vertical-relative:page;v-text-anchor:top" o:gfxdata="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" filled="f" stroked="f">
+              <v:fill o:detectmouseclick="t"/>
+              <v:textbox style="mso-fit-shape-to-text:t" inset="20pt,15pt,0,0">
+                <w:txbxContent>
+                  <w:p>
+                    <w:pPr>
+                      <w:rPr>
+                        <w:rFonts w:ascii="Arial" w:eastAsia="Arial" w:hAnsi="Arial" w:cs="Arial"/>
+                        <w:noProof/>
+                        <w:color w:val="000000"/>
+                        <w:sz w:val="16"/>
+                        <w:szCs w:val="16"/>
+                      </w:rPr>
+                    </w:pPr>
+                    <w:r>
+                      <w:rPr>
+                        <w:rFonts w:ascii="Arial" w:eastAsia="Arial" w:hAnsi="Arial" w:cs="Arial"/>
+                        <w:noProof/>
+                        <w:color w:val="000000"/>
+                        <w:sz w:val="16"/>
+                        <w:szCs w:val="16"/>
+                      </w:rPr>
+                      <w:t xml:space="preserve"> </w:t>
+                    </w:r>
+                  </w:p>
+                </w:txbxContent>
+              </v:textbox>
+              <w10:wrap anchorx="page" anchory="page"/>
+            </v:shape>
+          </w:pict>
+        </mc:Fallback>
+      </mc:AlternateContent>
+    </w:r>
+  </w:p>
+</w:hdr>
+</file>
+
 <file path=word/styles.xml><?xml version="1.0" encoding="utf-8"?>
-<w:styles xmlns:mc="http://schemas.openxmlformats.org/markup-compatibility/2006" xmlns:r="http://schemas.openxmlformats.org/officeDocument/2006/relationships" xmlns:w="http://schemas.openxmlformats.org/wordprocessingml/2006/main" xmlns:w14="http://schemas.microsoft.com/office/word/2010/wordml" xmlns:w15="http://schemas.microsoft.com/office/word/2012/wordml" xmlns:w16cex="http://schemas.microsoft.com/office/word/2018/wordml/cex" xmlns:w16cid="http://schemas.microsoft.com/office/word/2016/wordml/cid" xmlns:w16="http://schemas.microsoft.com/office/word/2018/wordml" xmlns:w16sdtdh="http://schemas.microsoft.com/office/word/2020/wordml/sdtdatahash" xmlns:w16sdtfl="http://schemas.microsoft.com/office/word/2024/wordml/sdtformatlock" xmlns:w16se="http://schemas.microsoft.com/office/word/2015/wordml/symex" xmlns:w16du="http://schemas.microsoft.com/office/word/2023/wordml/word16du" mc:Ignorable="w14 w15 w16se w16cid w16 w16cex w16sdtdh w16sdtfl w16du">
+<w:styles xmlns:mc="http://schemas.openxmlformats.org/markup-compatibility/2006" xmlns:r="http://schemas.openxmlformats.org/officeDocument/2006/relationships" xmlns:w="http://schemas.openxmlformats.org/wordprocessingml/2006/main" xmlns:w14="http://schemas.microsoft.com/office/word/2010/wordml" xmlns:w15="http://schemas.microsoft.com/office/word/2012/wordml" xmlns:w16cex="http://schemas.microsoft.com/office/word/2018/wordml/cex" xmlns:w16cid="http://schemas.microsoft.com/office/word/2016/wordml/cid" xmlns:w16="http://schemas.microsoft.com/office/word/2018/wordml" xmlns:w16du="http://schemas.microsoft.com/office/word/2023/wordml/word16du" xmlns:w16sdtdh="http://schemas.microsoft.com/office/word/2020/wordml/sdtdatahash" xmlns:w16sdtfl="http://schemas.microsoft.com/office/word/2024/wordml/sdtformatlock" xmlns:w16se="http://schemas.microsoft.com/office/word/2015/wordml/symex" mc:Ignorable="w14 w15 w16se w16cid w16 w16cex w16sdtdh w16sdtfl w16du">
   <w:docDefaults>
     <w:rPrDefault>
       <w:rPr>
@@ -874,7 +1340,6 @@
   <w:style w:type="character" w:default="1" w:styleId="Absatz-Standardschriftart">
     <w:name w:val="Default Paragraph Font"/>
     <w:uiPriority w:val="1"/>
-    <w:semiHidden/>
     <w:unhideWhenUsed/>
   </w:style>
   <w:style w:type="table" w:default="1" w:styleId="NormaleTabelle">
@@ -913,6 +1378,27 @@
         <w:insideV w:val="single" w:sz="4" w:space="0" w:color="auto"/>
       </w:tblBorders>
     </w:tblPr>
+  </w:style>
+  <w:style w:type="paragraph" w:styleId="Kopfzeile">
+    <w:name w:val="header"/>
+    <w:basedOn w:val="Standard"/>
+    <w:link w:val="KopfzeileZchn"/>
+    <w:uiPriority w:val="99"/>
+    <w:unhideWhenUsed/>
+    <w:rsid w:val="00A60DAD"/>
+    <w:pPr>
+      <w:tabs>
+        <w:tab w:val="center" w:pos="4536"/>
+        <w:tab w:val="right" w:pos="9072"/>
+      </w:tabs>
+    </w:pPr>
+  </w:style>
+  <w:style w:type="character" w:customStyle="1" w:styleId="KopfzeileZchn">
+    <w:name w:val="Kopfzeile Zchn"/>
+    <w:basedOn w:val="Absatz-Standardschriftart"/>
+    <w:link w:val="Kopfzeile"/>
+    <w:uiPriority w:val="99"/>
+    <w:rsid w:val="00A60DAD"/>
   </w:style>
 </w:styles>
 </file>
@@ -1176,4 +1662,10 @@
     </a:ext>
   </a:extLst>
 </a:theme>
+</file>
+
+<file path=docMetadata/LabelInfo.xml><?xml version="1.0" encoding="utf-8"?>
+<clbl:labelList xmlns:clbl="http://schemas.microsoft.com/office/2020/mipLabelMetadata">
+  <clbl:label id="{f5b21038-f9e1-4e7d-8ce4-653ce59968ea}" enabled="1" method="Privileged" siteId="{b9fec68c-c92d-461e-9a97-3d03a0f18b82}" contentBits="1" removed="0"/>
+</clbl:labelList>
 </file>
</xml_diff>